<commit_message>
Benchmark pass: add 2026-current content and close design gaps
After benchmarking vs comparable accessible courses and top university
offerings, add the high-value improvements reviewers identified:
- Week 9: reasoning models / test-time compute + context-engineering framing
- Week 11: modern RAG (hybrid search + reranking + Contextual Retrieval +
  agentic RAG) with a hands-on hybrid/rerank notebook
- Week 13: hands-on MCP server/client notebook, agent-memory taxonomy, MCP
  security, guardrails wired into the deployable Flask app, max_turns demo
- Week 16: post-training ladder (SFT -> DPO -> GRPO) named
- Week 17: judge-bias coverage + broadened Responsible AI section
- Week 15: provenance/watermarking (SynthID, C2PA)
- Week 5: self-check asserts, k-NN scaling demo, coefficient interpretation
- Week 8: de-risked pacing (concepts-first framing, lighter capstone start)
- Responsible AI added as an explicit course objective; model IDs normalized
</commit_message>
<xml_diff>
--- a/CSCI250-Fall2026/CSCI250-Fall2026-Syllabus.docx
+++ b/CSCI250-Fall2026/CSCI250-Fall2026-Syllabus.docx
@@ -238,7 +238,23 @@
         <w:t xml:space="preserve"> </w:t>
       </w:r>
       <w:r>
-        <w:t xml:space="preserve">You need to submit on Sunday nights 11:59PM. You will have two weeks for any assignment (Assignment 1 and Final are exception). Some of the assignments will be graded for the correctness. Some other Assignments are graded for the effort, but not necessarily for correctness (You will get grades even if you didn’t produce the correct result, but you need to show you made significant effort to get the correct result).</w:t>
+        <w:t xml:space="preserve">There are 10 assignments (A1–A10), each due</w:t>
+      </w:r>
+      <w:r>
+        <w:t xml:space="preserve"> </w:t>
+      </w:r>
+      <w:r>
+        <w:rPr>
+          <w:b/>
+          <w:bCs/>
+        </w:rPr>
+        <w:t xml:space="preserve">Sunday 11:59 PM PST</w:t>
+      </w:r>
+      <w:r>
+        <w:t xml:space="preserve"> </w:t>
+      </w:r>
+      <w:r>
+        <w:t xml:space="preserve">of its assigned week (see the Class Schedule). Some assignments are graded for correctness; others are graded for documented effort — you can earn credit for significant, shown effort even if the result isn’t fully correct. Correctness-graded assignments may be revised once.</w:t>
       </w:r>
     </w:p>
     <w:bookmarkEnd w:id="10"/>
@@ -343,7 +359,7 @@
       </w:r>
     </w:p>
     <w:bookmarkEnd w:id="11"/>
-    <w:bookmarkStart w:id="12" w:name="communications"/>
+    <w:bookmarkStart w:id="14" w:name="communications"/>
     <w:p>
       <w:pPr>
         <w:pStyle w:val="Heading2"/>
@@ -520,7 +536,38 @@
           <w:b/>
           <w:bCs/>
         </w:rPr>
-        <w:t xml:space="preserve">New students: read [Start-Here.md] first</w:t>
+        <w:t xml:space="preserve">New students: read</w:t>
+      </w:r>
+      <w:r>
+        <w:rPr>
+          <w:b/>
+          <w:bCs/>
+        </w:rPr>
+        <w:t xml:space="preserve"> </w:t>
+      </w:r>
+      <w:hyperlink r:id="rId12">
+        <w:r>
+          <w:rPr>
+            <w:rStyle w:val="Hyperlink"/>
+            <w:b/>
+            <w:bCs/>
+          </w:rPr>
+          <w:t xml:space="preserve">Start-Here.md</w:t>
+        </w:r>
+      </w:hyperlink>
+      <w:r>
+        <w:rPr>
+          <w:b/>
+          <w:bCs/>
+        </w:rPr>
+        <w:t xml:space="preserve"> </w:t>
+      </w:r>
+      <w:r>
+        <w:rPr>
+          <w:b/>
+          <w:bCs/>
+        </w:rPr>
+        <w:t xml:space="preserve">first</w:t>
       </w:r>
       <w:r>
         <w:t xml:space="preserve">, and keep the</w:t>
@@ -528,13 +575,16 @@
       <w:r>
         <w:t xml:space="preserve"> </w:t>
       </w:r>
-      <w:r>
-        <w:rPr>
-          <w:b/>
-          <w:bCs/>
-        </w:rPr>
-        <w:t xml:space="preserve">[Free-Tier-Playbook.md]</w:t>
-      </w:r>
+      <w:hyperlink r:id="rId13">
+        <w:r>
+          <w:rPr>
+            <w:rStyle w:val="Hyperlink"/>
+            <w:b/>
+            <w:bCs/>
+          </w:rPr>
+          <w:t xml:space="preserve">Free-Tier-Playbook.md</w:t>
+        </w:r>
+      </w:hyperlink>
       <w:r>
         <w:t xml:space="preserve"> </w:t>
       </w:r>
@@ -542,8 +592,8 @@
         <w:t xml:space="preserve">handy so cost and API keys are never a barrier ($0 course).</w:t>
       </w:r>
     </w:p>
-    <w:bookmarkEnd w:id="12"/>
-    <w:bookmarkStart w:id="13" w:name="prerequisiterecommended-preparation"/>
+    <w:bookmarkEnd w:id="14"/>
+    <w:bookmarkStart w:id="15" w:name="prerequisiterecommended-preparation"/>
     <w:p>
       <w:pPr>
         <w:pStyle w:val="Heading2"/>
@@ -560,8 +610,8 @@
         <w:t xml:space="preserve">Minimum grade of ‘C’ in CSCI114.</w:t>
       </w:r>
     </w:p>
-    <w:bookmarkEnd w:id="13"/>
-    <w:bookmarkStart w:id="14" w:name="course-description"/>
+    <w:bookmarkEnd w:id="15"/>
+    <w:bookmarkStart w:id="16" w:name="course-description"/>
     <w:p>
       <w:pPr>
         <w:pStyle w:val="Heading2"/>
@@ -615,8 +665,8 @@
         <w:t xml:space="preserve">— students will build applications with state-of-the-art tools and APIs (Anthropic Claude &amp; Claude Code, Google Gemini / AI Studio) and open-source/local models (Hugging Face, Ollama).</w:t>
       </w:r>
     </w:p>
-    <w:bookmarkEnd w:id="14"/>
-    <w:bookmarkStart w:id="15" w:name="outline-of-course-content"/>
+    <w:bookmarkEnd w:id="16"/>
+    <w:bookmarkStart w:id="17" w:name="outline-of-course-content"/>
     <w:p>
       <w:pPr>
         <w:pStyle w:val="Heading2"/>
@@ -759,8 +809,8 @@
         <w:t xml:space="preserve">- Development and deployment of AI/LLM pipelines (GenAI Ops)</w:t>
       </w:r>
     </w:p>
-    <w:bookmarkEnd w:id="15"/>
-    <w:bookmarkStart w:id="16" w:name="course-objectives"/>
+    <w:bookmarkEnd w:id="17"/>
+    <w:bookmarkStart w:id="18" w:name="course-objectives"/>
     <w:p>
       <w:pPr>
         <w:pStyle w:val="Heading2"/>
@@ -816,9 +866,25 @@
         </w:rPr>
         <w:t xml:space="preserve">Use AI-assisted coding tools (e.g., Claude Code) responsibly and effectively to build and test software</w:t>
       </w:r>
-    </w:p>
-    <w:bookmarkEnd w:id="16"/>
-    <w:bookmarkStart w:id="17" w:name="student-learning-outcomes"/>
+      <w:r>
+        <w:t xml:space="preserve"> </w:t>
+      </w:r>
+      <w:r>
+        <w:t xml:space="preserve">-</w:t>
+      </w:r>
+      <w:r>
+        <w:t xml:space="preserve"> </w:t>
+      </w:r>
+      <w:r>
+        <w:rPr>
+          <w:b/>
+          <w:bCs/>
+        </w:rPr>
+        <w:t xml:space="preserve">Reason about responsible AI — bias and fairness, privacy, transparency, and societal impact — as a recurring theme woven through the course (not a single topic)</w:t>
+      </w:r>
+    </w:p>
+    <w:bookmarkEnd w:id="18"/>
+    <w:bookmarkStart w:id="19" w:name="student-learning-outcomes"/>
     <w:p>
       <w:pPr>
         <w:pStyle w:val="Heading2"/>
@@ -877,8 +943,8 @@
         <w:t xml:space="preserve">– Students will be able to write code for solving simple computer vision, text processing, and LLM/Generative-AI problems by utilizing AI algorithms and AI-assisted development tools.</w:t>
       </w:r>
     </w:p>
-    <w:bookmarkEnd w:id="17"/>
-    <w:bookmarkStart w:id="18" w:name="grading-policy"/>
+    <w:bookmarkEnd w:id="19"/>
+    <w:bookmarkStart w:id="21" w:name="grading-policy"/>
     <w:p>
       <w:pPr>
         <w:pStyle w:val="Heading2"/>
@@ -1169,13 +1235,16 @@
       <w:r>
         <w:t xml:space="preserve"> </w:t>
       </w:r>
-      <w:r>
-        <w:rPr>
-          <w:b/>
-          <w:bCs/>
-        </w:rPr>
-        <w:t xml:space="preserve">[Rubrics.md]</w:t>
-      </w:r>
+      <w:hyperlink r:id="rId20">
+        <w:r>
+          <w:rPr>
+            <w:rStyle w:val="Hyperlink"/>
+            <w:b/>
+            <w:bCs/>
+          </w:rPr>
+          <w:t xml:space="preserve">Rubrics.md</w:t>
+        </w:r>
+      </w:hyperlink>
       <w:r>
         <w:t xml:space="preserve">.</w:t>
       </w:r>
@@ -1187,13 +1256,13 @@
           <w:b/>
           <w:bCs/>
         </w:rPr>
-        <w:t xml:space="preserve">Skills checks (S#) use pass/revise grading: if you don’t pass the first time, you may revise once (no penalty)</w:t>
-      </w:r>
-      <w:r>
-        <w:t xml:space="preserve"> </w:t>
-      </w:r>
-      <w:r>
-        <w:t xml:space="preserve">— the goal is mastery, not one-shot perfection. Each weekly assignment lists a realistic</w:t>
+        <w:t xml:space="preserve">Assignments graded for correctness may be revised once (no penalty)</w:t>
+      </w:r>
+      <w:r>
+        <w:t xml:space="preserve"> </w:t>
+      </w:r>
+      <w:r>
+        <w:t xml:space="preserve">if you don’t pass the first time — the goal is mastery, not one-shot perfection. Each weekly assignment lists a realistic</w:t>
       </w:r>
       <w:r>
         <w:t xml:space="preserve"> </w:t>
@@ -1225,8 +1294,8 @@
         <w:t xml:space="preserve">so you can gauge your understanding before graded work counts. The Midterm and Final scope and rubrics are published in Week 1 — no surprise assessments.</w:t>
       </w:r>
     </w:p>
-    <w:bookmarkEnd w:id="18"/>
-    <w:bookmarkStart w:id="19" w:name="textbooks"/>
+    <w:bookmarkEnd w:id="21"/>
+    <w:bookmarkStart w:id="22" w:name="textbooks"/>
     <w:p>
       <w:pPr>
         <w:pStyle w:val="Heading2"/>
@@ -1337,17 +1406,14 @@
           <w:b/>
           <w:bCs/>
         </w:rPr>
-        <w:t xml:space="preserve">(Required)</w:t>
-      </w:r>
-      <w:r>
-        <w:t xml:space="preserve"> </w:t>
-      </w:r>
-      <w:r>
-        <w:t xml:space="preserve">— Free online: https://www.mlsysbook.ai/</w:t>
-      </w:r>
-    </w:p>
-    <w:bookmarkEnd w:id="19"/>
-    <w:bookmarkStart w:id="20" w:name="exams"/>
+        <w:t xml:space="preserve">(Required — free online)</w:t>
+      </w:r>
+      <w:r>
+        <w:t xml:space="preserve">: https://www.mlsysbook.ai/</w:t>
+      </w:r>
+    </w:p>
+    <w:bookmarkEnd w:id="22"/>
+    <w:bookmarkStart w:id="23" w:name="exams"/>
     <w:p>
       <w:pPr>
         <w:pStyle w:val="Heading2"/>
@@ -1414,8 +1480,8 @@
         <w:t xml:space="preserve">Please note: There will be no make-up exam and the schedule can’t be changed for any reason. Please make plans accordingly. In the case of an unplanned emergency, your other scores will be prorated.</w:t>
       </w:r>
     </w:p>
-    <w:bookmarkEnd w:id="20"/>
-    <w:bookmarkStart w:id="21" w:name="Xee95654f83f406c23371e2d3fd03d5af961f4ac"/>
+    <w:bookmarkEnd w:id="23"/>
+    <w:bookmarkStart w:id="25" w:name="Xee95654f83f406c23371e2d3fd03d5af961f4ac"/>
     <w:p>
       <w:pPr>
         <w:pStyle w:val="Heading2"/>
@@ -1468,13 +1534,16 @@
       <w:r>
         <w:t xml:space="preserve"> </w:t>
       </w:r>
-      <w:r>
-        <w:rPr>
-          <w:b/>
-          <w:bCs/>
-        </w:rPr>
-        <w:t xml:space="preserve">[Final-Project-Capstone.md]</w:t>
-      </w:r>
+      <w:hyperlink r:id="rId24">
+        <w:r>
+          <w:rPr>
+            <w:rStyle w:val="Hyperlink"/>
+            <w:b/>
+            <w:bCs/>
+          </w:rPr>
+          <w:t xml:space="preserve">Final-Project-Capstone.md</w:t>
+        </w:r>
+      </w:hyperlink>
       <w:r>
         <w:t xml:space="preserve"> </w:t>
       </w:r>
@@ -1514,8 +1583,8 @@
         <w:t xml:space="preserve">11:59PM, Dec 19th, 2026</w:t>
       </w:r>
     </w:p>
-    <w:bookmarkEnd w:id="21"/>
-    <w:bookmarkStart w:id="22" w:name="case-studies"/>
+    <w:bookmarkEnd w:id="25"/>
+    <w:bookmarkStart w:id="26" w:name="case-studies"/>
     <w:p>
       <w:pPr>
         <w:pStyle w:val="Heading2"/>
@@ -1532,8 +1601,8 @@
         <w:t xml:space="preserve">Case studies will be provided during the semester.</w:t>
       </w:r>
     </w:p>
-    <w:bookmarkEnd w:id="22"/>
-    <w:bookmarkStart w:id="23" w:name="time-management"/>
+    <w:bookmarkEnd w:id="26"/>
+    <w:bookmarkStart w:id="27" w:name="time-management"/>
     <w:p>
       <w:pPr>
         <w:pStyle w:val="Heading2"/>
@@ -1550,8 +1619,8 @@
         <w:t xml:space="preserve">Labs and Assignments are required to be submitted by deadlines. Total 10 hours of time dedication each week is expected.</w:t>
       </w:r>
     </w:p>
-    <w:bookmarkEnd w:id="23"/>
-    <w:bookmarkStart w:id="24" w:name="late-assignments"/>
+    <w:bookmarkEnd w:id="27"/>
+    <w:bookmarkStart w:id="28" w:name="late-assignments"/>
     <w:p>
       <w:pPr>
         <w:pStyle w:val="Heading2"/>
@@ -1568,8 +1637,8 @@
         <w:t xml:space="preserve">Late submissions will not be accepted.</w:t>
       </w:r>
     </w:p>
-    <w:bookmarkEnd w:id="24"/>
-    <w:bookmarkStart w:id="25" w:name="drop-policy"/>
+    <w:bookmarkEnd w:id="28"/>
+    <w:bookmarkStart w:id="29" w:name="drop-policy"/>
     <w:p>
       <w:pPr>
         <w:pStyle w:val="Heading2"/>
@@ -1583,11 +1652,11 @@
         <w:pStyle w:val="FirstParagraph"/>
       </w:pPr>
       <w:r>
-        <w:t xml:space="preserve">A student will be dropped if the student fails to submit three consecutive skills and/or assignments on time.</w:t>
-      </w:r>
-    </w:p>
-    <w:bookmarkEnd w:id="25"/>
-    <w:bookmarkStart w:id="26" w:name="academic-integrity-responsible-use-of-ai"/>
+        <w:t xml:space="preserve">A student will be dropped if the student fails to submit three consecutive assignments on time.</w:t>
+      </w:r>
+    </w:p>
+    <w:bookmarkEnd w:id="29"/>
+    <w:bookmarkStart w:id="30" w:name="academic-integrity-responsible-use-of-ai"/>
     <w:p>
       <w:pPr>
         <w:pStyle w:val="Heading2"/>
@@ -1750,8 +1819,8 @@
         <w:t xml:space="preserve">When in doubt about whether a given use is allowed, ask me first.</w:t>
       </w:r>
     </w:p>
-    <w:bookmarkEnd w:id="26"/>
-    <w:bookmarkStart w:id="27" w:name="student-code-of-conduct"/>
+    <w:bookmarkEnd w:id="30"/>
+    <w:bookmarkStart w:id="31" w:name="student-code-of-conduct"/>
     <w:p>
       <w:pPr>
         <w:pStyle w:val="Heading2"/>
@@ -1768,8 +1837,8 @@
         <w:t xml:space="preserve">http://www.palomar.edu/Code_of_Conduct_condensed_version.pdf</w:t>
       </w:r>
     </w:p>
-    <w:bookmarkEnd w:id="27"/>
-    <w:bookmarkStart w:id="28" w:name="accessibility-universal-design"/>
+    <w:bookmarkEnd w:id="31"/>
+    <w:bookmarkStart w:id="32" w:name="accessibility-universal-design"/>
     <w:p>
       <w:pPr>
         <w:pStyle w:val="Heading2"/>
@@ -1828,8 +1897,8 @@
         <w:t xml:space="preserve">(short video + readable notes + runnable code) so you can learn the way that works best for you. If any material is not accessible to you, please tell me right away and I will fix it promptly.</w:t>
       </w:r>
     </w:p>
-    <w:bookmarkEnd w:id="28"/>
-    <w:bookmarkStart w:id="29" w:name="disability-accommodation"/>
+    <w:bookmarkEnd w:id="32"/>
+    <w:bookmarkStart w:id="33" w:name="disability-accommodation"/>
     <w:p>
       <w:pPr>
         <w:pStyle w:val="Heading2"/>
@@ -1865,7 +1934,7 @@
         <w:t xml:space="preserve">This syllabus is subject to change. Any changes will be announced in Canvas and the updated syllabus reposted. Last updated for Fall 2026.</w:t>
       </w:r>
     </w:p>
-    <w:bookmarkEnd w:id="29"/>
+    <w:bookmarkEnd w:id="33"/>
     <w:sectPr>
       <w:footnotePr>
         <w:numRestart w:val="eachSect"/>

</xml_diff>